<commit_message>
Refresh Wooden Sword Games CV and prepare Kozak Agency application
Regenerate the selected PHP CV and create a four-document Senior Go package from fresh GPT-6 Sol match analyses. Update the vacancy catalog and make CV PDF preview conversion reliable on Windows. Verified with 521 unit tests, deterministic application validation, and two-page visual review.
</commit_message>
<xml_diff>
--- a/registry/jobs/2026-10-02_121447_wooden-sword-games_senior-php-developer-game-backend_cb978155-40d1-43dd-b93e-d8f5c42cbd1d/application/CV_ValentinNikolaev_woodenswordgames_SeniorPHPDeveloperGameBackend.docx
+++ b/registry/jobs/2026-10-02_121447_wooden-sword-games_senior-php-developer-game-backend_cb978155-40d1-43dd-b93e-d8f5c42cbd1d/application/CV_ValentinNikolaev_woodenswordgames_SeniorPHPDeveloperGameBackend.docx
@@ -55,7 +55,7 @@
         </w:rPr>
         <w:t xml:space="preserve">Rome, Italy | </w:t>
       </w:r>
-      <w:hyperlink w:history="1" r:id="rIdbxe0okfv_7tngyj9an0vb">
+      <w:hyperlink w:history="1" r:id="rId2pwowsozo3gizmlxn-jtq">
         <w:r>
           <w:rPr>
             <w:rFonts w:ascii="Aptos" w:cs="Aptos" w:eastAsia="Aptos" w:hAnsi="Aptos"/>
@@ -78,7 +78,7 @@
         </w:rPr>
         <w:t xml:space="preserve"> | +39 351 370 1194 | LinkedIn: </w:t>
       </w:r>
-      <w:hyperlink w:history="1" r:id="rId1opcodzhdzcrslour1aii">
+      <w:hyperlink w:history="1" r:id="rIdqbi7mrxwkr8br0vcffmua">
         <w:r>
           <w:rPr>
             <w:rFonts w:ascii="Aptos" w:cs="Aptos" w:eastAsia="Aptos" w:hAnsi="Aptos"/>
@@ -101,7 +101,7 @@
         </w:rPr>
         <w:t xml:space="preserve"> | GitHub: </w:t>
       </w:r>
-      <w:hyperlink w:history="1" r:id="rIdvhuv72sobeltoc4gejix4">
+      <w:hyperlink w:history="1" r:id="rIdgu2cbqaxgnjs2ibyn2qhs">
         <w:r>
           <w:rPr>
             <w:rFonts w:ascii="Aptos" w:cs="Aptos" w:eastAsia="Aptos" w:hAnsi="Aptos"/>
@@ -149,7 +149,7 @@
           <w:szCs w:val="24"/>
           <w:rtl w:val="false"/>
         </w:rPr>
-        <w:t xml:space="preserve">Backend engineer with 15+ years of experience building production systems in PHP and Go. Recent work combines PHP event analytics with high-volume backend ownership: a Go support platform handled more than 20,000 tickets in an ordinary month and up to three times that volume in peak season. I bring Laravel, REST APIs, PostgreSQL, performance, reliability, and a practical approach to clear service contracts and maintainable delivery.</w:t>
+        <w:t xml:space="preserve">Senior PHP and Go backend engineer with more than 15 years of production experience. In recent PHP consulting work, I held technical ownership of a live event analytics platform and its service integrations; my earlier Laravel experience includes backend development and API delivery. I have improved throughput and delivery reliability in production systems, worked with PostgreSQL and event-driven services, and led backend work through substantial traffic peaks. I bring hands-on ownership, code review experience, and a practical focus on maintainable service contracts and performance.</w:t>
       </w:r>
     </w:p>
     <w:p>
@@ -186,7 +186,7 @@
           <w:szCs w:val="24"/>
           <w:rtl w:val="false"/>
         </w:rPr>
-        <w:t xml:space="preserve">PHP, Laravel, Symfony, Go, REST APIs, PostgreSQL, MySQL, RabbitMQ, AWS EventBridge, queues, event-driven systems, API contracts, system design, performance analysis, code review, monitoring</w:t>
+        <w:t xml:space="preserve">Languages and frameworks: PHP, Laravel, Symfony, Go. Backend and data: REST APIs, PostgreSQL, MySQL, SQL optimization, event-driven architecture, queues, AWS EventBridge. Delivery and operations: performance analysis, monitoring, RabbitMQ, Kubernetes, GitHub Actions, code review.</w:t>
       </w:r>
     </w:p>
     <w:p>
@@ -249,7 +249,7 @@
           <w:szCs w:val="24"/>
           <w:rtl w:val="false"/>
         </w:rPr>
-        <w:t xml:space="preserve">Owned a Go support platform processing at least 20,000 tickets per ordinary month, with volume up to three times that level in the U.S. peak season.</w:t>
+        <w:t xml:space="preserve">Owned a Go support platform connecting Zendesk, Intercom, and internal services, giving support teams a shared backend for routing and ticket lifecycle work.</w:t>
       </w:r>
     </w:p>
     <w:p>
@@ -270,7 +270,7 @@
           <w:szCs w:val="24"/>
           <w:rtl w:val="false"/>
         </w:rPr>
-        <w:t xml:space="preserve">Implemented many automation scenarios on a support platform that reached up to 86% fully automated handling.</w:t>
+        <w:t xml:space="preserve">Implemented many support automation scenarios, contributing to a platform that reached up to 86% fully automated handling overall.</w:t>
       </w:r>
     </w:p>
     <w:p>
@@ -291,7 +291,7 @@
           <w:szCs w:val="24"/>
           <w:rtl w:val="false"/>
         </w:rPr>
-        <w:t xml:space="preserve">Designed and launched an A/B test of in-house ticket categorization against Intercom Fin, then migrated to Fin while retaining the ML model as a fallback.</w:t>
+        <w:t xml:space="preserve">Designed an A/B comparison of in-house ticket categorization and Intercom Fin, then moved categorization to Fin with the in-house model retained as fallback.</w:t>
       </w:r>
     </w:p>
     <w:p>
@@ -312,8 +312,51 @@
           <w:szCs w:val="24"/>
           <w:rtl w:val="false"/>
         </w:rPr>
-        <w:t xml:space="preserve">Built public-review automation across App Store, Google Play, and TrustPilot, with keyword guardrails that route sensitive or legal cases to human review.</w:t>
-      </w:r>
+        <w:t xml:space="preserve">Built public-review automation across App Store, Google Play, and Trustpilot, routing sensitive or legal cases to a human reviewer instead of an automatic reply.</w:t>
+      </w:r>
+    </w:p>
+    <w:p>
+      <w:pPr>
+        <w:bidi w:val="false"/>
+        <w:spacing w:after="120" w:before="120" w:line="259.20000000000005"/>
+        <w:jc w:val="left"/>
+      </w:pPr>
+      <w:r>
+        <w:rPr>
+          <w:rFonts w:ascii="Aptos" w:cs="Aptos" w:eastAsia="Aptos" w:hAnsi="Aptos"/>
+          <w:color w:val="000000"/>
+          <w:sz w:val="24"/>
+          <w:szCs w:val="24"/>
+          <w:rtl w:val="false"/>
+        </w:rPr>
+        <w:t xml:space="preserve">Technologies: Go, PostgreSQL, Intercom API, Zendesk API, AWS, Kubernetes, monitoring</w:t>
+      </w:r>
+    </w:p>
+    <w:p>
+      <w:r>
+        <w:br w:type="page"/>
+      </w:r>
+    </w:p>
+    <w:p>
+      <w:pPr>
+        <w:pStyle w:val="3"/>
+        <w:pStyle w:val="Heading3"/>
+        <w:bidi w:val="false"/>
+        <w:spacing w:after="120" w:before="240"/>
+        <w:keepNext/>
+      </w:pPr>
+      <w:bookmarkStart w:name="_Toc_CRURATED_PHP_Software_Developer_concurre_6" w:id="1"/>
+      <w:r>
+        <w:rPr>
+          <w:rFonts w:ascii="Aptos" w:cs="Aptos" w:eastAsia="Aptos" w:hAnsi="Aptos"/>
+          <w:color w:val="000000"/>
+          <w:sz w:val="24"/>
+          <w:szCs w:val="24"/>
+          <w:rtl w:val="false"/>
+        </w:rPr>
+        <w:t xml:space="preserve">CRURATED — PHP Software Developer, concurrent part-time consulting | August 2024 – January 2026</w:t>
+      </w:r>
+      <w:bookmarkEnd w:id="1"/>
     </w:p>
     <w:p>
       <w:pPr>
@@ -324,55 +367,18 @@
         </w:numPr>
         <w:bidi w:val="false"/>
         <w:spacing w:after="60" w:before="60"/>
-      </w:pPr>
-      <w:r>
-        <w:rPr>
-          <w:rFonts w:ascii="Aptos" w:cs="Aptos" w:eastAsia="Aptos" w:hAnsi="Aptos"/>
-          <w:color w:val="000000"/>
-          <w:sz w:val="24"/>
-          <w:szCs w:val="24"/>
-          <w:rtl w:val="false"/>
-        </w:rPr>
-        <w:t xml:space="preserve">Built cancellation and refund email automation with a deletion-request classifier that routed active deletion requests to L1, alongside production fixes for the workflow.</w:t>
-      </w:r>
-    </w:p>
-    <w:p>
-      <w:pPr>
-        <w:bidi w:val="false"/>
-        <w:spacing w:after="120" w:before="120" w:line="259.20000000000005"/>
-        <w:jc w:val="left"/>
-      </w:pPr>
-      <w:r>
-        <w:rPr>
-          <w:rFonts w:ascii="Aptos" w:cs="Aptos" w:eastAsia="Aptos" w:hAnsi="Aptos"/>
-          <w:color w:val="000000"/>
-          <w:sz w:val="24"/>
-          <w:szCs w:val="24"/>
-          <w:rtl w:val="false"/>
-        </w:rPr>
-        <w:t xml:space="preserve">Technologies: Go, PHP, PostgreSQL, Intercom API, AWS, Kubernetes, OpenAPI, DeepL, monitoring</w:t>
-      </w:r>
-    </w:p>
-    <w:p>
-      <w:pPr>
-        <w:pStyle w:val="3"/>
-        <w:pStyle w:val="Heading3"/>
-        <w:bidi w:val="false"/>
-        <w:spacing w:after="120" w:before="240"/>
         <w:keepNext/>
       </w:pPr>
-      <w:bookmarkStart w:name="_Toc_CRURATED_PHP_Software_Developer_concurre_6" w:id="1"/>
-      <w:r>
-        <w:rPr>
-          <w:rFonts w:ascii="Aptos" w:cs="Aptos" w:eastAsia="Aptos" w:hAnsi="Aptos"/>
-          <w:color w:val="000000"/>
-          <w:sz w:val="24"/>
-          <w:szCs w:val="24"/>
-          <w:rtl w:val="false"/>
-        </w:rPr>
-        <w:t xml:space="preserve">CRURATED — PHP Software Developer, concurrent part-time subcontract / consulting engagement | August 2024 – January 2026</w:t>
-      </w:r>
-      <w:bookmarkEnd w:id="1"/>
+      <w:r>
+        <w:rPr>
+          <w:rFonts w:ascii="Aptos" w:cs="Aptos" w:eastAsia="Aptos" w:hAnsi="Aptos"/>
+          <w:color w:val="000000"/>
+          <w:sz w:val="24"/>
+          <w:szCs w:val="24"/>
+          <w:rtl w:val="false"/>
+        </w:rPr>
+        <w:t xml:space="preserve">Owned the production DataLake and event analytics system as its technical lead, increasing throughput by more than 10x for product reporting.</w:t>
+      </w:r>
     </w:p>
     <w:p>
       <w:pPr>
@@ -383,17 +389,16 @@
         </w:numPr>
         <w:bidi w:val="false"/>
         <w:spacing w:after="60" w:before="60"/>
-        <w:keepNext/>
-      </w:pPr>
-      <w:r>
-        <w:rPr>
-          <w:rFonts w:ascii="Aptos" w:cs="Aptos" w:eastAsia="Aptos" w:hAnsi="Aptos"/>
-          <w:color w:val="000000"/>
-          <w:sz w:val="24"/>
-          <w:szCs w:val="24"/>
-          <w:rtl w:val="false"/>
-        </w:rPr>
-        <w:t xml:space="preserve">Held full technical ownership of production DataLake and event analytics work for product metrics, reporting, and business insights.</w:t>
+      </w:pPr>
+      <w:r>
+        <w:rPr>
+          <w:rFonts w:ascii="Aptos" w:cs="Aptos" w:eastAsia="Aptos" w:hAnsi="Aptos"/>
+          <w:color w:val="000000"/>
+          <w:sz w:val="24"/>
+          <w:szCs w:val="24"/>
+          <w:rtl w:val="false"/>
+        </w:rPr>
+        <w:t xml:space="preserve">Simplified analytics stream setup through modular design, cutting the onboarding time from several days to under four hours.</w:t>
       </w:r>
     </w:p>
     <w:p>
@@ -414,7 +419,7 @@
           <w:szCs w:val="24"/>
           <w:rtl w:val="false"/>
         </w:rPr>
-        <w:t xml:space="preserve">Owned a production Crutrade integration covering authentication and OTP, account linking, collection import and export, purchase-ownership verification, and request/response logging.</w:t>
+        <w:t xml:space="preserve">Maintained event delivery reliability above 99.9% in the production analytics pipeline through routing and operational controls.</w:t>
       </w:r>
     </w:p>
     <w:p>
@@ -435,7 +440,7 @@
           <w:szCs w:val="24"/>
           <w:rtl w:val="false"/>
         </w:rPr>
-        <w:t xml:space="preserve">Owned production parallel publication of event versions as the platform evolved.</w:t>
+        <w:t xml:space="preserve">Owned parallel publication of event versions in production, keeping old and new schemas available during the analytics transition.</w:t>
       </w:r>
     </w:p>
     <w:p>
@@ -452,7 +457,7 @@
           <w:szCs w:val="24"/>
           <w:rtl w:val="false"/>
         </w:rPr>
-        <w:t xml:space="preserve">Technologies: PHP, Laravel, AWS EventBridge, queues, event-driven architecture, REST APIs</w:t>
+        <w:t xml:space="preserve">Technologies: PHP, Laravel, AWS EventBridge, queues, REST APIs, event-driven architecture</w:t>
       </w:r>
     </w:p>
     <w:p>
@@ -495,7 +500,7 @@
           <w:szCs w:val="24"/>
           <w:rtl w:val="false"/>
         </w:rPr>
-        <w:t xml:space="preserve">Led five backend engineers developing a transactional email service handling about 3 million emails in an ordinary month.</w:t>
+        <w:t xml:space="preserve">Led five backend engineers delivering a transactional email service that handled about three million messages in an ordinary month.</w:t>
       </w:r>
     </w:p>
     <w:p>
@@ -516,7 +521,7 @@
           <w:szCs w:val="24"/>
           <w:rtl w:val="false"/>
         </w:rPr>
-        <w:t xml:space="preserve">Guided the service through BFCM e-commerce peaks of up to 10x ordinary traffic, applying DNS, DKIM, SPF, DMARC, and feedback-loop expertise.</w:t>
+        <w:t xml:space="preserve">Led the backend team through BFCM peaks reaching up to ten times ordinary email traffic, applying messaging and deliverability expertise under the seasonal surge.</w:t>
       </w:r>
     </w:p>
     <w:p>
@@ -533,7 +538,7 @@
           <w:szCs w:val="24"/>
           <w:rtl w:val="false"/>
         </w:rPr>
-        <w:t xml:space="preserve">Technologies: PHP, Laravel, MySQL, Elasticsearch, RabbitMQ, AWS, email infrastructure</w:t>
+        <w:t xml:space="preserve">Technologies: PHP, Laravel, MySQL, RabbitMQ, AWS, email infrastructure</w:t>
       </w:r>
     </w:p>
     <w:p>
@@ -607,7 +612,7 @@
           <w:szCs w:val="24"/>
           <w:rtl w:val="false"/>
         </w:rPr>
-        <w:t xml:space="preserve">Ukrainian: native | English: upper-intermediate | Russian: native</w:t>
+        <w:t xml:space="preserve">Ukrainian: native | English: upper-intermediate</w:t>
       </w:r>
     </w:p>
     <w:sectPr>

</xml_diff>

<commit_message>
Restore airSlate experience in Wooden and Kozak CVs
Reviewed project changes
</commit_message>
<xml_diff>
--- a/registry/jobs/2026-10-02_121447_wooden-sword-games_senior-php-developer-game-backend_cb978155-40d1-43dd-b93e-d8f5c42cbd1d/application/CV_ValentinNikolaev_woodenswordgames_SeniorPHPDeveloperGameBackend.docx
+++ b/registry/jobs/2026-10-02_121447_wooden-sword-games_senior-php-developer-game-backend_cb978155-40d1-43dd-b93e-d8f5c42cbd1d/application/CV_ValentinNikolaev_woodenswordgames_SeniorPHPDeveloperGameBackend.docx
@@ -55,7 +55,7 @@
         </w:rPr>
         <w:t xml:space="preserve">Rome, Italy | </w:t>
       </w:r>
-      <w:hyperlink w:history="1" r:id="rId2pwowsozo3gizmlxn-jtq">
+      <w:hyperlink w:history="1" r:id="rIdcchan1uwh2pms5m16h3ib">
         <w:r>
           <w:rPr>
             <w:rFonts w:ascii="Aptos" w:cs="Aptos" w:eastAsia="Aptos" w:hAnsi="Aptos"/>
@@ -78,7 +78,7 @@
         </w:rPr>
         <w:t xml:space="preserve"> | +39 351 370 1194 | LinkedIn: </w:t>
       </w:r>
-      <w:hyperlink w:history="1" r:id="rIdqbi7mrxwkr8br0vcffmua">
+      <w:hyperlink w:history="1" r:id="rIdsbq1ytnhyae5owbx8x6o9">
         <w:r>
           <w:rPr>
             <w:rFonts w:ascii="Aptos" w:cs="Aptos" w:eastAsia="Aptos" w:hAnsi="Aptos"/>
@@ -101,7 +101,7 @@
         </w:rPr>
         <w:t xml:space="preserve"> | GitHub: </w:t>
       </w:r>
-      <w:hyperlink w:history="1" r:id="rIdgu2cbqaxgnjs2ibyn2qhs">
+      <w:hyperlink w:history="1" r:id="rIdrevuky-e83gt5vvgnrmv4">
         <w:r>
           <w:rPr>
             <w:rFonts w:ascii="Aptos" w:cs="Aptos" w:eastAsia="Aptos" w:hAnsi="Aptos"/>
@@ -149,7 +149,7 @@
           <w:szCs w:val="24"/>
           <w:rtl w:val="false"/>
         </w:rPr>
-        <w:t xml:space="preserve">Senior PHP and Go backend engineer with more than 15 years of production experience. In recent PHP consulting work, I held technical ownership of a live event analytics platform and its service integrations; my earlier Laravel experience includes backend development and API delivery. I have improved throughput and delivery reliability in production systems, worked with PostgreSQL and event-driven services, and led backend work through substantial traffic peaks. I bring hands-on ownership, code review experience, and a practical focus on maintainable service contracts and performance.</w:t>
+        <w:t xml:space="preserve">Senior PHP and Go backend engineer with more than 15 years of production experience. In recent PHP consulting work, I held technical ownership of a live event analytics platform and its service integrations; at airSlate, I improved database stability during high-traffic periods and worked on PHP/Laravel services. I have improved throughput and delivery reliability in production systems, worked with PostgreSQL and event-driven services, and led backend work through substantial traffic peaks. I bring hands-on ownership, code review experience, and a practical focus on maintainable service contracts and performance.</w:t>
       </w:r>
     </w:p>
     <w:p>
@@ -468,16 +468,16 @@
         <w:spacing w:after="120" w:before="240"/>
         <w:keepNext/>
       </w:pPr>
-      <w:bookmarkStart w:name="_Toc_PDFfiller_Software_Developer_October_201_7" w:id="1"/>
-      <w:r>
-        <w:rPr>
-          <w:rFonts w:ascii="Aptos" w:cs="Aptos" w:eastAsia="Aptos" w:hAnsi="Aptos"/>
-          <w:color w:val="000000"/>
-          <w:sz w:val="24"/>
-          <w:szCs w:val="24"/>
-          <w:rtl w:val="false"/>
-        </w:rPr>
-        <w:t xml:space="preserve">PDFfiller — Software Developer | October 2016 – November 2019</w:t>
+      <w:bookmarkStart w:name="_Toc_airSlate_Software_Developer_February_202_7" w:id="1"/>
+      <w:r>
+        <w:rPr>
+          <w:rFonts w:ascii="Aptos" w:cs="Aptos" w:eastAsia="Aptos" w:hAnsi="Aptos"/>
+          <w:color w:val="000000"/>
+          <w:sz w:val="24"/>
+          <w:szCs w:val="24"/>
+          <w:rtl w:val="false"/>
+        </w:rPr>
+        <w:t xml:space="preserve">airSlate — Software Developer | February 2021 – August 2023</w:t>
       </w:r>
       <w:bookmarkEnd w:id="1"/>
     </w:p>
@@ -500,28 +500,70 @@
           <w:szCs w:val="24"/>
           <w:rtl w:val="false"/>
         </w:rPr>
-        <w:t xml:space="preserve">Led five backend engineers delivering a transactional email service that handled about three million messages in an ordinary month.</w:t>
-      </w:r>
-    </w:p>
-    <w:p>
-      <w:pPr>
-        <w:pStyle w:val="ListParagraph"/>
-        <w:numPr>
-          <w:ilvl w:val="0"/>
-          <w:numId w:val="1"/>
-        </w:numPr>
-        <w:bidi w:val="false"/>
-        <w:spacing w:after="60" w:before="60"/>
-      </w:pPr>
-      <w:r>
-        <w:rPr>
-          <w:rFonts w:ascii="Aptos" w:cs="Aptos" w:eastAsia="Aptos" w:hAnsi="Aptos"/>
-          <w:color w:val="000000"/>
-          <w:sz w:val="24"/>
-          <w:szCs w:val="24"/>
-          <w:rtl w:val="false"/>
-        </w:rPr>
-        <w:t xml:space="preserve">Led the backend team through BFCM peaks reaching up to ten times ordinary email traffic, applying messaging and deliverability expertise under the seasonal surge.</w:t>
+        <w:t xml:space="preserve">Led backend work that lowered the main database's maximum workload to 65%, protecting service stability during peak traffic.</w:t>
+      </w:r>
+    </w:p>
+    <w:p>
+      <w:pPr>
+        <w:pStyle w:val="ListParagraph"/>
+        <w:numPr>
+          <w:ilvl w:val="0"/>
+          <w:numId w:val="1"/>
+        </w:numPr>
+        <w:bidi w:val="false"/>
+        <w:spacing w:after="60" w:before="60"/>
+      </w:pPr>
+      <w:r>
+        <w:rPr>
+          <w:rFonts w:ascii="Aptos" w:cs="Aptos" w:eastAsia="Aptos" w:hAnsi="Aptos"/>
+          <w:color w:val="000000"/>
+          <w:sz w:val="24"/>
+          <w:szCs w:val="24"/>
+          <w:rtl w:val="false"/>
+        </w:rPr>
+        <w:t xml:space="preserve">Directed performance optimization across backend services that reduced average API response times by 30%.</w:t>
+      </w:r>
+    </w:p>
+    <w:p>
+      <w:pPr>
+        <w:pStyle w:val="ListParagraph"/>
+        <w:numPr>
+          <w:ilvl w:val="0"/>
+          <w:numId w:val="1"/>
+        </w:numPr>
+        <w:bidi w:val="false"/>
+        <w:spacing w:after="60" w:before="60"/>
+      </w:pPr>
+      <w:r>
+        <w:rPr>
+          <w:rFonts w:ascii="Aptos" w:cs="Aptos" w:eastAsia="Aptos" w:hAnsi="Aptos"/>
+          <w:color w:val="000000"/>
+          <w:sz w:val="24"/>
+          <w:szCs w:val="24"/>
+          <w:rtl w:val="false"/>
+        </w:rPr>
+        <w:t xml:space="preserve">Led CI/CD improvements that cut feature delivery time by 11 minutes, an approximately 70% improvement.</w:t>
+      </w:r>
+    </w:p>
+    <w:p>
+      <w:pPr>
+        <w:pStyle w:val="ListParagraph"/>
+        <w:numPr>
+          <w:ilvl w:val="0"/>
+          <w:numId w:val="1"/>
+        </w:numPr>
+        <w:bidi w:val="false"/>
+        <w:spacing w:after="60" w:before="60"/>
+      </w:pPr>
+      <w:r>
+        <w:rPr>
+          <w:rFonts w:ascii="Aptos" w:cs="Aptos" w:eastAsia="Aptos" w:hAnsi="Aptos"/>
+          <w:color w:val="000000"/>
+          <w:sz w:val="24"/>
+          <w:szCs w:val="24"/>
+          <w:rtl w:val="false"/>
+        </w:rPr>
+        <w:t xml:space="preserve">Defined and tracked development-team metrics while directing backend delivery, contributing to an approximately 20% increase in feature delivery rate.</w:t>
       </w:r>
     </w:p>
     <w:p>
@@ -538,6 +580,87 @@
           <w:szCs w:val="24"/>
           <w:rtl w:val="false"/>
         </w:rPr>
+        <w:t xml:space="preserve">Technologies: PHP, Laravel, MySQL, Elasticsearch, RabbitMQ, AWS, REST APIs, CI/CD</w:t>
+      </w:r>
+    </w:p>
+    <w:p>
+      <w:pPr>
+        <w:pStyle w:val="3"/>
+        <w:pStyle w:val="Heading3"/>
+        <w:bidi w:val="false"/>
+        <w:spacing w:after="120" w:before="240"/>
+        <w:keepNext/>
+      </w:pPr>
+      <w:bookmarkStart w:name="_Toc_PDFfiller_Software_Developer_October_201_8" w:id="1"/>
+      <w:r>
+        <w:rPr>
+          <w:rFonts w:ascii="Aptos" w:cs="Aptos" w:eastAsia="Aptos" w:hAnsi="Aptos"/>
+          <w:color w:val="000000"/>
+          <w:sz w:val="24"/>
+          <w:szCs w:val="24"/>
+          <w:rtl w:val="false"/>
+        </w:rPr>
+        <w:t xml:space="preserve">PDFfiller — Software Developer | October 2016 – November 2019</w:t>
+      </w:r>
+      <w:bookmarkEnd w:id="1"/>
+    </w:p>
+    <w:p>
+      <w:pPr>
+        <w:pStyle w:val="ListParagraph"/>
+        <w:numPr>
+          <w:ilvl w:val="0"/>
+          <w:numId w:val="1"/>
+        </w:numPr>
+        <w:bidi w:val="false"/>
+        <w:spacing w:after="60" w:before="60"/>
+        <w:keepNext/>
+      </w:pPr>
+      <w:r>
+        <w:rPr>
+          <w:rFonts w:ascii="Aptos" w:cs="Aptos" w:eastAsia="Aptos" w:hAnsi="Aptos"/>
+          <w:color w:val="000000"/>
+          <w:sz w:val="24"/>
+          <w:szCs w:val="24"/>
+          <w:rtl w:val="false"/>
+        </w:rPr>
+        <w:t xml:space="preserve">Led five backend engineers delivering a transactional email service that handled about three million messages in an ordinary month.</w:t>
+      </w:r>
+    </w:p>
+    <w:p>
+      <w:pPr>
+        <w:pStyle w:val="ListParagraph"/>
+        <w:numPr>
+          <w:ilvl w:val="0"/>
+          <w:numId w:val="1"/>
+        </w:numPr>
+        <w:bidi w:val="false"/>
+        <w:spacing w:after="60" w:before="60"/>
+      </w:pPr>
+      <w:r>
+        <w:rPr>
+          <w:rFonts w:ascii="Aptos" w:cs="Aptos" w:eastAsia="Aptos" w:hAnsi="Aptos"/>
+          <w:color w:val="000000"/>
+          <w:sz w:val="24"/>
+          <w:szCs w:val="24"/>
+          <w:rtl w:val="false"/>
+        </w:rPr>
+        <w:t xml:space="preserve">Led the backend team through BFCM peaks reaching up to ten times ordinary email traffic, applying messaging and deliverability expertise under the seasonal surge.</w:t>
+      </w:r>
+    </w:p>
+    <w:p>
+      <w:pPr>
+        <w:bidi w:val="false"/>
+        <w:spacing w:after="120" w:before="120" w:line="259.20000000000005"/>
+        <w:jc w:val="left"/>
+      </w:pPr>
+      <w:r>
+        <w:rPr>
+          <w:rFonts w:ascii="Aptos" w:cs="Aptos" w:eastAsia="Aptos" w:hAnsi="Aptos"/>
+          <w:color w:val="000000"/>
+          <w:sz w:val="24"/>
+          <w:szCs w:val="24"/>
+          <w:rtl w:val="false"/>
+        </w:rPr>
         <w:t xml:space="preserve">Technologies: PHP, Laravel, MySQL, RabbitMQ, AWS, email infrastructure</w:t>
       </w:r>
     </w:p>
@@ -548,7 +671,7 @@
         <w:bidi w:val="false"/>
         <w:spacing w:after="120" w:before="240"/>
       </w:pPr>
-      <w:bookmarkStart w:name="_Toc_Education_8" w:id="1"/>
+      <w:bookmarkStart w:name="_Toc_Education_9" w:id="1"/>
       <w:r>
         <w:rPr>
           <w:rFonts w:ascii="Aptos" w:cs="Aptos" w:eastAsia="Aptos" w:hAnsi="Aptos"/>
@@ -585,7 +708,7 @@
         <w:bidi w:val="false"/>
         <w:spacing w:after="120" w:before="240"/>
       </w:pPr>
-      <w:bookmarkStart w:name="_Toc_Languages_9" w:id="1"/>
+      <w:bookmarkStart w:name="_Toc_Languages_10" w:id="1"/>
       <w:r>
         <w:rPr>
           <w:rFonts w:ascii="Aptos" w:cs="Aptos" w:eastAsia="Aptos" w:hAnsi="Aptos"/>

</xml_diff>